<commit_message>
feat: fill all 6 team members with QM numbers — FINAL for submission
</commit_message>
<xml_diff>
--- a/deliverables/First_Brief_Report_group104.docx
+++ b/deliverables/First_Brief_Report_group104.docx
@@ -60,8 +60,7 @@
       </w:tblPr>
       <w:tblGrid>
         <w:gridCol w:w="1838"/>
-        <w:gridCol w:w="3119"/>
-        <w:gridCol w:w="4059"/>
+        <w:gridCol w:w="7178"/>
       </w:tblGrid>
       <w:tr>
         <w:tc>
@@ -90,29 +89,7 @@
         </w:tc>
         <w:tc>
           <w:tcPr>
-            <w:tcW w:w="3119" w:type="dxa"/>
-          </w:tcPr>
-          <w:p>
-            <w:pPr>
-              <w:rPr>
-                <w:rFonts w:ascii="Times New Roman" w:hAnsi="Times New Roman" w:cs="Times New Roman"/>
-                <w:sz w:val="22"/>
-                <w:szCs w:val="22"/>
-              </w:rPr>
-            </w:pPr>
-            <w:r>
-              <w:rPr>
-                <w:rFonts w:ascii="Times New Roman" w:hAnsi="Times New Roman" w:cs="Times New Roman"/>
-                <w:sz w:val="22"/>
-                <w:szCs w:val="22"/>
-              </w:rPr>
-              <w:t xml:space="preserve"/>
-            </w:r>
-          </w:p>
-        </w:tc>
-        <w:tc>
-          <w:tcPr>
-            <w:tcW w:w="3000" w:type="dxa"/>
+            <w:tcW w:w="7178" w:type="dxa"/>
           </w:tcPr>
           <w:p/>
         </w:tc>
@@ -179,7 +156,7 @@
                 <w:sz w:val="22"/>
                 <w:szCs w:val="22"/>
               </w:rPr>
-              <w:t xml:space="preserve">QM no:</w:t>
+              <w:t xml:space="preserve"/>
             </w:r>
           </w:p>
         </w:tc>
@@ -201,7 +178,7 @@
                 <w:sz w:val="22"/>
                 <w:szCs w:val="22"/>
               </w:rPr>
-              <w:t xml:space="preserve">Name:</w:t>
+              <w:t xml:space="preserve"/>
             </w:r>
           </w:p>
         </w:tc>
@@ -227,7 +204,7 @@
                 <w:sz w:val="22"/>
                 <w:szCs w:val="22"/>
               </w:rPr>
-              <w:t xml:space="preserve">member 2</w:t>
+              <w:t xml:space="preserve">QM no:</w:t>
             </w:r>
           </w:p>
         </w:tc>
@@ -249,7 +226,7 @@
                 <w:sz w:val="22"/>
                 <w:szCs w:val="22"/>
               </w:rPr>
-              <w:t xml:space="preserve">QM no:</w:t>
+              <w:t xml:space="preserve">231223128</w:t>
             </w:r>
           </w:p>
         </w:tc>
@@ -271,7 +248,7 @@
                 <w:sz w:val="22"/>
                 <w:szCs w:val="22"/>
               </w:rPr>
-              <w:t xml:space="preserve">Name:</w:t>
+              <w:t xml:space="preserve"/>
             </w:r>
           </w:p>
         </w:tc>
@@ -297,7 +274,7 @@
                 <w:sz w:val="22"/>
                 <w:szCs w:val="22"/>
               </w:rPr>
-              <w:t xml:space="preserve">member 3</w:t>
+              <w:t xml:space="preserve">ZhuohangTIAN</w:t>
             </w:r>
           </w:p>
         </w:tc>
@@ -319,7 +296,7 @@
                 <w:sz w:val="22"/>
                 <w:szCs w:val="22"/>
               </w:rPr>
-              <w:t xml:space="preserve">QM no:</w:t>
+              <w:t xml:space="preserve"/>
             </w:r>
           </w:p>
         </w:tc>
@@ -341,7 +318,96 @@
                 <w:sz w:val="22"/>
                 <w:szCs w:val="22"/>
               </w:rPr>
-              <w:t xml:space="preserve">Name:</w:t>
+              <w:t xml:space="preserve"/>
+            </w:r>
+          </w:p>
+        </w:tc>
+      </w:tr>
+    </w:tbl>
+    <w:tbl>
+      <w:tblPr>
+        <w:tblStyle w:val="TableGrid"/>
+        <w:tblW w:w="0" w:type="auto"/>
+        <w:tblBorders>
+          <w:top w:val="single" w:sz="4" w:space="0" w:color="auto"/>
+          <w:left w:val="single" w:sz="4" w:space="0" w:color="auto"/>
+          <w:bottom w:val="single" w:sz="4" w:space="0" w:color="auto"/>
+          <w:right w:val="single" w:sz="4" w:space="0" w:color="auto"/>
+          <w:insideH w:val="single" w:sz="4" w:space="0" w:color="auto"/>
+          <w:insideV w:val="single" w:sz="4" w:space="0" w:color="auto"/>
+        </w:tblBorders>
+      </w:tblPr>
+      <w:tblGrid>
+        <w:gridCol w:w="1838"/>
+        <w:gridCol w:w="3119"/>
+        <w:gridCol w:w="4059"/>
+      </w:tblGrid>
+      <w:tr>
+        <w:tc>
+          <w:tcPr>
+            <w:tcW w:w="1838" w:type="dxa"/>
+          </w:tcPr>
+          <w:p>
+            <w:pPr>
+              <w:rPr>
+                <w:rFonts w:ascii="Times New Roman" w:hAnsi="Times New Roman" w:cs="Times New Roman"/>
+                <w:b/>
+                <w:sz w:val="22"/>
+                <w:szCs w:val="22"/>
+              </w:rPr>
+            </w:pPr>
+            <w:r>
+              <w:rPr>
+                <w:rFonts w:ascii="Times New Roman" w:hAnsi="Times New Roman" w:cs="Times New Roman"/>
+                <w:b/>
+                <w:sz w:val="22"/>
+                <w:szCs w:val="22"/>
+              </w:rPr>
+              <w:t xml:space="preserve">member 2</w:t>
+            </w:r>
+          </w:p>
+        </w:tc>
+        <w:tc>
+          <w:tcPr>
+            <w:tcW w:w="3119" w:type="dxa"/>
+          </w:tcPr>
+          <w:p>
+            <w:pPr>
+              <w:rPr>
+                <w:rFonts w:ascii="Times New Roman" w:hAnsi="Times New Roman" w:cs="Times New Roman"/>
+                <w:sz w:val="22"/>
+                <w:szCs w:val="22"/>
+              </w:rPr>
+            </w:pPr>
+            <w:r>
+              <w:rPr>
+                <w:rFonts w:ascii="Times New Roman" w:hAnsi="Times New Roman" w:cs="Times New Roman"/>
+                <w:sz w:val="22"/>
+                <w:szCs w:val="22"/>
+              </w:rPr>
+              <w:t xml:space="preserve"/>
+            </w:r>
+          </w:p>
+        </w:tc>
+        <w:tc>
+          <w:tcPr>
+            <w:tcW w:w="4059" w:type="dxa"/>
+          </w:tcPr>
+          <w:p>
+            <w:pPr>
+              <w:rPr>
+                <w:rFonts w:ascii="Times New Roman" w:hAnsi="Times New Roman" w:cs="Times New Roman"/>
+                <w:sz w:val="22"/>
+                <w:szCs w:val="22"/>
+              </w:rPr>
+            </w:pPr>
+            <w:r>
+              <w:rPr>
+                <w:rFonts w:ascii="Times New Roman" w:hAnsi="Times New Roman" w:cs="Times New Roman"/>
+                <w:sz w:val="22"/>
+                <w:szCs w:val="22"/>
+              </w:rPr>
+              <w:t xml:space="preserve"/>
             </w:r>
           </w:p>
         </w:tc>
@@ -367,7 +433,7 @@
                 <w:sz w:val="22"/>
                 <w:szCs w:val="22"/>
               </w:rPr>
-              <w:t xml:space="preserve">member 4</w:t>
+              <w:t xml:space="preserve">QM no:</w:t>
             </w:r>
           </w:p>
         </w:tc>
@@ -389,7 +455,7 @@
                 <w:sz w:val="22"/>
                 <w:szCs w:val="22"/>
               </w:rPr>
-              <w:t xml:space="preserve">QM no:</w:t>
+              <w:t xml:space="preserve">231223117</w:t>
             </w:r>
           </w:p>
         </w:tc>
@@ -411,7 +477,7 @@
                 <w:sz w:val="22"/>
                 <w:szCs w:val="22"/>
               </w:rPr>
-              <w:t xml:space="preserve">Name:</w:t>
+              <w:t xml:space="preserve"/>
             </w:r>
           </w:p>
         </w:tc>
@@ -437,7 +503,7 @@
                 <w:sz w:val="22"/>
                 <w:szCs w:val="22"/>
               </w:rPr>
-              <w:t xml:space="preserve">member 5</w:t>
+              <w:t xml:space="preserve">WeiyeCHEN</w:t>
             </w:r>
           </w:p>
         </w:tc>
@@ -459,7 +525,7 @@
                 <w:sz w:val="22"/>
                 <w:szCs w:val="22"/>
               </w:rPr>
-              <w:t xml:space="preserve">QM no:</w:t>
+              <w:t xml:space="preserve"/>
             </w:r>
           </w:p>
         </w:tc>
@@ -481,7 +547,96 @@
                 <w:sz w:val="22"/>
                 <w:szCs w:val="22"/>
               </w:rPr>
-              <w:t xml:space="preserve">Name:</w:t>
+              <w:t xml:space="preserve"/>
+            </w:r>
+          </w:p>
+        </w:tc>
+      </w:tr>
+    </w:tbl>
+    <w:tbl>
+      <w:tblPr>
+        <w:tblStyle w:val="TableGrid"/>
+        <w:tblW w:w="0" w:type="auto"/>
+        <w:tblBorders>
+          <w:top w:val="single" w:sz="4" w:space="0" w:color="auto"/>
+          <w:left w:val="single" w:sz="4" w:space="0" w:color="auto"/>
+          <w:bottom w:val="single" w:sz="4" w:space="0" w:color="auto"/>
+          <w:right w:val="single" w:sz="4" w:space="0" w:color="auto"/>
+          <w:insideH w:val="single" w:sz="4" w:space="0" w:color="auto"/>
+          <w:insideV w:val="single" w:sz="4" w:space="0" w:color="auto"/>
+        </w:tblBorders>
+      </w:tblPr>
+      <w:tblGrid>
+        <w:gridCol w:w="1838"/>
+        <w:gridCol w:w="3119"/>
+        <w:gridCol w:w="4059"/>
+      </w:tblGrid>
+      <w:tr>
+        <w:tc>
+          <w:tcPr>
+            <w:tcW w:w="1838" w:type="dxa"/>
+          </w:tcPr>
+          <w:p>
+            <w:pPr>
+              <w:rPr>
+                <w:rFonts w:ascii="Times New Roman" w:hAnsi="Times New Roman" w:cs="Times New Roman"/>
+                <w:b/>
+                <w:sz w:val="22"/>
+                <w:szCs w:val="22"/>
+              </w:rPr>
+            </w:pPr>
+            <w:r>
+              <w:rPr>
+                <w:rFonts w:ascii="Times New Roman" w:hAnsi="Times New Roman" w:cs="Times New Roman"/>
+                <w:b/>
+                <w:sz w:val="22"/>
+                <w:szCs w:val="22"/>
+              </w:rPr>
+              <w:t xml:space="preserve">member 3</w:t>
+            </w:r>
+          </w:p>
+        </w:tc>
+        <w:tc>
+          <w:tcPr>
+            <w:tcW w:w="3119" w:type="dxa"/>
+          </w:tcPr>
+          <w:p>
+            <w:pPr>
+              <w:rPr>
+                <w:rFonts w:ascii="Times New Roman" w:hAnsi="Times New Roman" w:cs="Times New Roman"/>
+                <w:sz w:val="22"/>
+                <w:szCs w:val="22"/>
+              </w:rPr>
+            </w:pPr>
+            <w:r>
+              <w:rPr>
+                <w:rFonts w:ascii="Times New Roman" w:hAnsi="Times New Roman" w:cs="Times New Roman"/>
+                <w:sz w:val="22"/>
+                <w:szCs w:val="22"/>
+              </w:rPr>
+              <w:t xml:space="preserve"/>
+            </w:r>
+          </w:p>
+        </w:tc>
+        <w:tc>
+          <w:tcPr>
+            <w:tcW w:w="4059" w:type="dxa"/>
+          </w:tcPr>
+          <w:p>
+            <w:pPr>
+              <w:rPr>
+                <w:rFonts w:ascii="Times New Roman" w:hAnsi="Times New Roman" w:cs="Times New Roman"/>
+                <w:sz w:val="22"/>
+                <w:szCs w:val="22"/>
+              </w:rPr>
+            </w:pPr>
+            <w:r>
+              <w:rPr>
+                <w:rFonts w:ascii="Times New Roman" w:hAnsi="Times New Roman" w:cs="Times New Roman"/>
+                <w:sz w:val="22"/>
+                <w:szCs w:val="22"/>
+              </w:rPr>
+              <w:t xml:space="preserve"/>
             </w:r>
           </w:p>
         </w:tc>
@@ -507,6 +662,623 @@
                 <w:sz w:val="22"/>
                 <w:szCs w:val="22"/>
               </w:rPr>
+              <w:t xml:space="preserve">QM no:</w:t>
+            </w:r>
+          </w:p>
+        </w:tc>
+        <w:tc>
+          <w:tcPr>
+            <w:tcW w:w="3119" w:type="dxa"/>
+          </w:tcPr>
+          <w:p>
+            <w:pPr>
+              <w:rPr>
+                <w:rFonts w:ascii="Times New Roman" w:hAnsi="Times New Roman" w:cs="Times New Roman"/>
+                <w:sz w:val="22"/>
+                <w:szCs w:val="22"/>
+              </w:rPr>
+            </w:pPr>
+            <w:r>
+              <w:rPr>
+                <w:rFonts w:ascii="Times New Roman" w:hAnsi="Times New Roman" w:cs="Times New Roman"/>
+                <w:sz w:val="22"/>
+                <w:szCs w:val="22"/>
+              </w:rPr>
+              <w:t xml:space="preserve">231223092</w:t>
+            </w:r>
+          </w:p>
+        </w:tc>
+        <w:tc>
+          <w:tcPr>
+            <w:tcW w:w="4059" w:type="dxa"/>
+          </w:tcPr>
+          <w:p>
+            <w:pPr>
+              <w:rPr>
+                <w:rFonts w:ascii="Times New Roman" w:hAnsi="Times New Roman" w:cs="Times New Roman"/>
+                <w:sz w:val="22"/>
+                <w:szCs w:val="22"/>
+              </w:rPr>
+            </w:pPr>
+            <w:r>
+              <w:rPr>
+                <w:rFonts w:ascii="Times New Roman" w:hAnsi="Times New Roman" w:cs="Times New Roman"/>
+                <w:sz w:val="22"/>
+                <w:szCs w:val="22"/>
+              </w:rPr>
+              <w:t xml:space="preserve"/>
+            </w:r>
+          </w:p>
+        </w:tc>
+      </w:tr>
+      <w:tr>
+        <w:tc>
+          <w:tcPr>
+            <w:tcW w:w="1838" w:type="dxa"/>
+          </w:tcPr>
+          <w:p>
+            <w:pPr>
+              <w:rPr>
+                <w:rFonts w:ascii="Times New Roman" w:hAnsi="Times New Roman" w:cs="Times New Roman"/>
+                <w:b/>
+                <w:sz w:val="22"/>
+                <w:szCs w:val="22"/>
+              </w:rPr>
+            </w:pPr>
+            <w:r>
+              <w:rPr>
+                <w:rFonts w:ascii="Times New Roman" w:hAnsi="Times New Roman" w:cs="Times New Roman"/>
+                <w:b/>
+                <w:sz w:val="22"/>
+                <w:szCs w:val="22"/>
+              </w:rPr>
+              <w:t xml:space="preserve">QianLI</w:t>
+            </w:r>
+          </w:p>
+        </w:tc>
+        <w:tc>
+          <w:tcPr>
+            <w:tcW w:w="3119" w:type="dxa"/>
+          </w:tcPr>
+          <w:p>
+            <w:pPr>
+              <w:rPr>
+                <w:rFonts w:ascii="Times New Roman" w:hAnsi="Times New Roman" w:cs="Times New Roman"/>
+                <w:sz w:val="22"/>
+                <w:szCs w:val="22"/>
+              </w:rPr>
+            </w:pPr>
+            <w:r>
+              <w:rPr>
+                <w:rFonts w:ascii="Times New Roman" w:hAnsi="Times New Roman" w:cs="Times New Roman"/>
+                <w:sz w:val="22"/>
+                <w:szCs w:val="22"/>
+              </w:rPr>
+              <w:t xml:space="preserve"/>
+            </w:r>
+          </w:p>
+        </w:tc>
+        <w:tc>
+          <w:tcPr>
+            <w:tcW w:w="4059" w:type="dxa"/>
+          </w:tcPr>
+          <w:p>
+            <w:pPr>
+              <w:rPr>
+                <w:rFonts w:ascii="Times New Roman" w:hAnsi="Times New Roman" w:cs="Times New Roman"/>
+                <w:sz w:val="22"/>
+                <w:szCs w:val="22"/>
+              </w:rPr>
+            </w:pPr>
+            <w:r>
+              <w:rPr>
+                <w:rFonts w:ascii="Times New Roman" w:hAnsi="Times New Roman" w:cs="Times New Roman"/>
+                <w:sz w:val="22"/>
+                <w:szCs w:val="22"/>
+              </w:rPr>
+              <w:t xml:space="preserve"/>
+            </w:r>
+          </w:p>
+        </w:tc>
+      </w:tr>
+    </w:tbl>
+    <w:tbl>
+      <w:tblPr>
+        <w:tblStyle w:val="TableGrid"/>
+        <w:tblW w:w="0" w:type="auto"/>
+        <w:tblBorders>
+          <w:top w:val="single" w:sz="4" w:space="0" w:color="auto"/>
+          <w:left w:val="single" w:sz="4" w:space="0" w:color="auto"/>
+          <w:bottom w:val="single" w:sz="4" w:space="0" w:color="auto"/>
+          <w:right w:val="single" w:sz="4" w:space="0" w:color="auto"/>
+          <w:insideH w:val="single" w:sz="4" w:space="0" w:color="auto"/>
+          <w:insideV w:val="single" w:sz="4" w:space="0" w:color="auto"/>
+        </w:tblBorders>
+      </w:tblPr>
+      <w:tblGrid>
+        <w:gridCol w:w="1838"/>
+        <w:gridCol w:w="3119"/>
+        <w:gridCol w:w="4059"/>
+      </w:tblGrid>
+      <w:tr>
+        <w:tc>
+          <w:tcPr>
+            <w:tcW w:w="1838" w:type="dxa"/>
+          </w:tcPr>
+          <w:p>
+            <w:pPr>
+              <w:rPr>
+                <w:rFonts w:ascii="Times New Roman" w:hAnsi="Times New Roman" w:cs="Times New Roman"/>
+                <w:b/>
+                <w:sz w:val="22"/>
+                <w:szCs w:val="22"/>
+              </w:rPr>
+            </w:pPr>
+            <w:r>
+              <w:rPr>
+                <w:rFonts w:ascii="Times New Roman" w:hAnsi="Times New Roman" w:cs="Times New Roman"/>
+                <w:b/>
+                <w:sz w:val="22"/>
+                <w:szCs w:val="22"/>
+              </w:rPr>
+              <w:t xml:space="preserve">member 4</w:t>
+            </w:r>
+          </w:p>
+        </w:tc>
+        <w:tc>
+          <w:tcPr>
+            <w:tcW w:w="3119" w:type="dxa"/>
+          </w:tcPr>
+          <w:p>
+            <w:pPr>
+              <w:rPr>
+                <w:rFonts w:ascii="Times New Roman" w:hAnsi="Times New Roman" w:cs="Times New Roman"/>
+                <w:sz w:val="22"/>
+                <w:szCs w:val="22"/>
+              </w:rPr>
+            </w:pPr>
+            <w:r>
+              <w:rPr>
+                <w:rFonts w:ascii="Times New Roman" w:hAnsi="Times New Roman" w:cs="Times New Roman"/>
+                <w:sz w:val="22"/>
+                <w:szCs w:val="22"/>
+              </w:rPr>
+              <w:t xml:space="preserve"/>
+            </w:r>
+          </w:p>
+        </w:tc>
+        <w:tc>
+          <w:tcPr>
+            <w:tcW w:w="4059" w:type="dxa"/>
+          </w:tcPr>
+          <w:p>
+            <w:pPr>
+              <w:rPr>
+                <w:rFonts w:ascii="Times New Roman" w:hAnsi="Times New Roman" w:cs="Times New Roman"/>
+                <w:sz w:val="22"/>
+                <w:szCs w:val="22"/>
+              </w:rPr>
+            </w:pPr>
+            <w:r>
+              <w:rPr>
+                <w:rFonts w:ascii="Times New Roman" w:hAnsi="Times New Roman" w:cs="Times New Roman"/>
+                <w:sz w:val="22"/>
+                <w:szCs w:val="22"/>
+              </w:rPr>
+              <w:t xml:space="preserve"/>
+            </w:r>
+          </w:p>
+        </w:tc>
+      </w:tr>
+      <w:tr>
+        <w:tc>
+          <w:tcPr>
+            <w:tcW w:w="1838" w:type="dxa"/>
+          </w:tcPr>
+          <w:p>
+            <w:pPr>
+              <w:rPr>
+                <w:rFonts w:ascii="Times New Roman" w:hAnsi="Times New Roman" w:cs="Times New Roman"/>
+                <w:b/>
+                <w:sz w:val="22"/>
+                <w:szCs w:val="22"/>
+              </w:rPr>
+            </w:pPr>
+            <w:r>
+              <w:rPr>
+                <w:rFonts w:ascii="Times New Roman" w:hAnsi="Times New Roman" w:cs="Times New Roman"/>
+                <w:b/>
+                <w:sz w:val="22"/>
+                <w:szCs w:val="22"/>
+              </w:rPr>
+              <w:t xml:space="preserve">QM no:</w:t>
+            </w:r>
+          </w:p>
+        </w:tc>
+        <w:tc>
+          <w:tcPr>
+            <w:tcW w:w="3119" w:type="dxa"/>
+          </w:tcPr>
+          <w:p>
+            <w:pPr>
+              <w:rPr>
+                <w:rFonts w:ascii="Times New Roman" w:hAnsi="Times New Roman" w:cs="Times New Roman"/>
+                <w:sz w:val="22"/>
+                <w:szCs w:val="22"/>
+              </w:rPr>
+            </w:pPr>
+            <w:r>
+              <w:rPr>
+                <w:rFonts w:ascii="Times New Roman" w:hAnsi="Times New Roman" w:cs="Times New Roman"/>
+                <w:sz w:val="22"/>
+                <w:szCs w:val="22"/>
+              </w:rPr>
+              <w:t xml:space="preserve">231223106</w:t>
+            </w:r>
+          </w:p>
+        </w:tc>
+        <w:tc>
+          <w:tcPr>
+            <w:tcW w:w="4059" w:type="dxa"/>
+          </w:tcPr>
+          <w:p>
+            <w:pPr>
+              <w:rPr>
+                <w:rFonts w:ascii="Times New Roman" w:hAnsi="Times New Roman" w:cs="Times New Roman"/>
+                <w:sz w:val="22"/>
+                <w:szCs w:val="22"/>
+              </w:rPr>
+            </w:pPr>
+            <w:r>
+              <w:rPr>
+                <w:rFonts w:ascii="Times New Roman" w:hAnsi="Times New Roman" w:cs="Times New Roman"/>
+                <w:sz w:val="22"/>
+                <w:szCs w:val="22"/>
+              </w:rPr>
+              <w:t xml:space="preserve"/>
+            </w:r>
+          </w:p>
+        </w:tc>
+      </w:tr>
+      <w:tr>
+        <w:tc>
+          <w:tcPr>
+            <w:tcW w:w="1838" w:type="dxa"/>
+          </w:tcPr>
+          <w:p>
+            <w:pPr>
+              <w:rPr>
+                <w:rFonts w:ascii="Times New Roman" w:hAnsi="Times New Roman" w:cs="Times New Roman"/>
+                <w:b/>
+                <w:sz w:val="22"/>
+                <w:szCs w:val="22"/>
+              </w:rPr>
+            </w:pPr>
+            <w:r>
+              <w:rPr>
+                <w:rFonts w:ascii="Times New Roman" w:hAnsi="Times New Roman" w:cs="Times New Roman"/>
+                <w:b/>
+                <w:sz w:val="22"/>
+                <w:szCs w:val="22"/>
+              </w:rPr>
+              <w:t xml:space="preserve">ZehaoYANG</w:t>
+            </w:r>
+          </w:p>
+        </w:tc>
+        <w:tc>
+          <w:tcPr>
+            <w:tcW w:w="3119" w:type="dxa"/>
+          </w:tcPr>
+          <w:p>
+            <w:pPr>
+              <w:rPr>
+                <w:rFonts w:ascii="Times New Roman" w:hAnsi="Times New Roman" w:cs="Times New Roman"/>
+                <w:sz w:val="22"/>
+                <w:szCs w:val="22"/>
+              </w:rPr>
+            </w:pPr>
+            <w:r>
+              <w:rPr>
+                <w:rFonts w:ascii="Times New Roman" w:hAnsi="Times New Roman" w:cs="Times New Roman"/>
+                <w:sz w:val="22"/>
+                <w:szCs w:val="22"/>
+              </w:rPr>
+              <w:t xml:space="preserve"/>
+            </w:r>
+          </w:p>
+        </w:tc>
+        <w:tc>
+          <w:tcPr>
+            <w:tcW w:w="4059" w:type="dxa"/>
+          </w:tcPr>
+          <w:p>
+            <w:pPr>
+              <w:rPr>
+                <w:rFonts w:ascii="Times New Roman" w:hAnsi="Times New Roman" w:cs="Times New Roman"/>
+                <w:sz w:val="22"/>
+                <w:szCs w:val="22"/>
+              </w:rPr>
+            </w:pPr>
+            <w:r>
+              <w:rPr>
+                <w:rFonts w:ascii="Times New Roman" w:hAnsi="Times New Roman" w:cs="Times New Roman"/>
+                <w:sz w:val="22"/>
+                <w:szCs w:val="22"/>
+              </w:rPr>
+              <w:t xml:space="preserve"/>
+            </w:r>
+          </w:p>
+        </w:tc>
+      </w:tr>
+    </w:tbl>
+    <w:tbl>
+      <w:tblPr>
+        <w:tblStyle w:val="TableGrid"/>
+        <w:tblW w:w="0" w:type="auto"/>
+        <w:tblBorders>
+          <w:top w:val="single" w:sz="4" w:space="0" w:color="auto"/>
+          <w:left w:val="single" w:sz="4" w:space="0" w:color="auto"/>
+          <w:bottom w:val="single" w:sz="4" w:space="0" w:color="auto"/>
+          <w:right w:val="single" w:sz="4" w:space="0" w:color="auto"/>
+          <w:insideH w:val="single" w:sz="4" w:space="0" w:color="auto"/>
+          <w:insideV w:val="single" w:sz="4" w:space="0" w:color="auto"/>
+        </w:tblBorders>
+      </w:tblPr>
+      <w:tblGrid>
+        <w:gridCol w:w="1838"/>
+        <w:gridCol w:w="3119"/>
+        <w:gridCol w:w="4059"/>
+      </w:tblGrid>
+      <w:tr>
+        <w:tc>
+          <w:tcPr>
+            <w:tcW w:w="1838" w:type="dxa"/>
+          </w:tcPr>
+          <w:p>
+            <w:pPr>
+              <w:rPr>
+                <w:rFonts w:ascii="Times New Roman" w:hAnsi="Times New Roman" w:cs="Times New Roman"/>
+                <w:b/>
+                <w:sz w:val="22"/>
+                <w:szCs w:val="22"/>
+              </w:rPr>
+            </w:pPr>
+            <w:r>
+              <w:rPr>
+                <w:rFonts w:ascii="Times New Roman" w:hAnsi="Times New Roman" w:cs="Times New Roman"/>
+                <w:b/>
+                <w:sz w:val="22"/>
+                <w:szCs w:val="22"/>
+              </w:rPr>
+              <w:t xml:space="preserve">member 5</w:t>
+            </w:r>
+          </w:p>
+        </w:tc>
+        <w:tc>
+          <w:tcPr>
+            <w:tcW w:w="3119" w:type="dxa"/>
+          </w:tcPr>
+          <w:p>
+            <w:pPr>
+              <w:rPr>
+                <w:rFonts w:ascii="Times New Roman" w:hAnsi="Times New Roman" w:cs="Times New Roman"/>
+                <w:sz w:val="22"/>
+                <w:szCs w:val="22"/>
+              </w:rPr>
+            </w:pPr>
+            <w:r>
+              <w:rPr>
+                <w:rFonts w:ascii="Times New Roman" w:hAnsi="Times New Roman" w:cs="Times New Roman"/>
+                <w:sz w:val="22"/>
+                <w:szCs w:val="22"/>
+              </w:rPr>
+              <w:t xml:space="preserve"/>
+            </w:r>
+          </w:p>
+        </w:tc>
+        <w:tc>
+          <w:tcPr>
+            <w:tcW w:w="4059" w:type="dxa"/>
+          </w:tcPr>
+          <w:p>
+            <w:pPr>
+              <w:rPr>
+                <w:rFonts w:ascii="Times New Roman" w:hAnsi="Times New Roman" w:cs="Times New Roman"/>
+                <w:sz w:val="22"/>
+                <w:szCs w:val="22"/>
+              </w:rPr>
+            </w:pPr>
+            <w:r>
+              <w:rPr>
+                <w:rFonts w:ascii="Times New Roman" w:hAnsi="Times New Roman" w:cs="Times New Roman"/>
+                <w:sz w:val="22"/>
+                <w:szCs w:val="22"/>
+              </w:rPr>
+              <w:t xml:space="preserve"/>
+            </w:r>
+          </w:p>
+        </w:tc>
+      </w:tr>
+      <w:tr>
+        <w:tc>
+          <w:tcPr>
+            <w:tcW w:w="1838" w:type="dxa"/>
+          </w:tcPr>
+          <w:p>
+            <w:pPr>
+              <w:rPr>
+                <w:rFonts w:ascii="Times New Roman" w:hAnsi="Times New Roman" w:cs="Times New Roman"/>
+                <w:b/>
+                <w:sz w:val="22"/>
+                <w:szCs w:val="22"/>
+              </w:rPr>
+            </w:pPr>
+            <w:r>
+              <w:rPr>
+                <w:rFonts w:ascii="Times New Roman" w:hAnsi="Times New Roman" w:cs="Times New Roman"/>
+                <w:b/>
+                <w:sz w:val="22"/>
+                <w:szCs w:val="22"/>
+              </w:rPr>
+              <w:t xml:space="preserve">QM no:</w:t>
+            </w:r>
+          </w:p>
+        </w:tc>
+        <w:tc>
+          <w:tcPr>
+            <w:tcW w:w="3119" w:type="dxa"/>
+          </w:tcPr>
+          <w:p>
+            <w:pPr>
+              <w:rPr>
+                <w:rFonts w:ascii="Times New Roman" w:hAnsi="Times New Roman" w:cs="Times New Roman"/>
+                <w:sz w:val="22"/>
+                <w:szCs w:val="22"/>
+              </w:rPr>
+            </w:pPr>
+            <w:r>
+              <w:rPr>
+                <w:rFonts w:ascii="Times New Roman" w:hAnsi="Times New Roman" w:cs="Times New Roman"/>
+                <w:sz w:val="22"/>
+                <w:szCs w:val="22"/>
+              </w:rPr>
+              <w:t xml:space="preserve">231223069</w:t>
+            </w:r>
+          </w:p>
+        </w:tc>
+        <w:tc>
+          <w:tcPr>
+            <w:tcW w:w="4059" w:type="dxa"/>
+          </w:tcPr>
+          <w:p>
+            <w:pPr>
+              <w:rPr>
+                <w:rFonts w:ascii="Times New Roman" w:hAnsi="Times New Roman" w:cs="Times New Roman"/>
+                <w:sz w:val="22"/>
+                <w:szCs w:val="22"/>
+              </w:rPr>
+            </w:pPr>
+            <w:r>
+              <w:rPr>
+                <w:rFonts w:ascii="Times New Roman" w:hAnsi="Times New Roman" w:cs="Times New Roman"/>
+                <w:sz w:val="22"/>
+                <w:szCs w:val="22"/>
+              </w:rPr>
+              <w:t xml:space="preserve"/>
+            </w:r>
+          </w:p>
+        </w:tc>
+      </w:tr>
+      <w:tr>
+        <w:tc>
+          <w:tcPr>
+            <w:tcW w:w="1838" w:type="dxa"/>
+          </w:tcPr>
+          <w:p>
+            <w:pPr>
+              <w:rPr>
+                <w:rFonts w:ascii="Times New Roman" w:hAnsi="Times New Roman" w:cs="Times New Roman"/>
+                <w:b/>
+                <w:sz w:val="22"/>
+                <w:szCs w:val="22"/>
+              </w:rPr>
+            </w:pPr>
+            <w:r>
+              <w:rPr>
+                <w:rFonts w:ascii="Times New Roman" w:hAnsi="Times New Roman" w:cs="Times New Roman"/>
+                <w:b/>
+                <w:sz w:val="22"/>
+                <w:szCs w:val="22"/>
+              </w:rPr>
+              <w:t xml:space="preserve">BowenLAI</w:t>
+            </w:r>
+          </w:p>
+        </w:tc>
+        <w:tc>
+          <w:tcPr>
+            <w:tcW w:w="3119" w:type="dxa"/>
+          </w:tcPr>
+          <w:p>
+            <w:pPr>
+              <w:rPr>
+                <w:rFonts w:ascii="Times New Roman" w:hAnsi="Times New Roman" w:cs="Times New Roman"/>
+                <w:sz w:val="22"/>
+                <w:szCs w:val="22"/>
+              </w:rPr>
+            </w:pPr>
+            <w:r>
+              <w:rPr>
+                <w:rFonts w:ascii="Times New Roman" w:hAnsi="Times New Roman" w:cs="Times New Roman"/>
+                <w:sz w:val="22"/>
+                <w:szCs w:val="22"/>
+              </w:rPr>
+              <w:t xml:space="preserve"/>
+            </w:r>
+          </w:p>
+        </w:tc>
+        <w:tc>
+          <w:tcPr>
+            <w:tcW w:w="4059" w:type="dxa"/>
+          </w:tcPr>
+          <w:p>
+            <w:pPr>
+              <w:rPr>
+                <w:rFonts w:ascii="Times New Roman" w:hAnsi="Times New Roman" w:cs="Times New Roman"/>
+                <w:sz w:val="22"/>
+                <w:szCs w:val="22"/>
+              </w:rPr>
+            </w:pPr>
+            <w:r>
+              <w:rPr>
+                <w:rFonts w:ascii="Times New Roman" w:hAnsi="Times New Roman" w:cs="Times New Roman"/>
+                <w:sz w:val="22"/>
+                <w:szCs w:val="22"/>
+              </w:rPr>
+              <w:t xml:space="preserve"/>
+            </w:r>
+          </w:p>
+        </w:tc>
+      </w:tr>
+    </w:tbl>
+    <w:tbl>
+      <w:tblPr>
+        <w:tblStyle w:val="TableGrid"/>
+        <w:tblW w:w="0" w:type="auto"/>
+        <w:tblBorders>
+          <w:top w:val="single" w:sz="4" w:space="0" w:color="auto"/>
+          <w:left w:val="single" w:sz="4" w:space="0" w:color="auto"/>
+          <w:bottom w:val="single" w:sz="4" w:space="0" w:color="auto"/>
+          <w:right w:val="single" w:sz="4" w:space="0" w:color="auto"/>
+          <w:insideH w:val="single" w:sz="4" w:space="0" w:color="auto"/>
+          <w:insideV w:val="single" w:sz="4" w:space="0" w:color="auto"/>
+        </w:tblBorders>
+      </w:tblPr>
+      <w:tblGrid>
+        <w:gridCol w:w="1838"/>
+        <w:gridCol w:w="3119"/>
+        <w:gridCol w:w="4059"/>
+      </w:tblGrid>
+      <w:tr>
+        <w:tc>
+          <w:tcPr>
+            <w:tcW w:w="1838" w:type="dxa"/>
+          </w:tcPr>
+          <w:p>
+            <w:pPr>
+              <w:rPr>
+                <w:rFonts w:ascii="Times New Roman" w:hAnsi="Times New Roman" w:cs="Times New Roman"/>
+                <w:b/>
+                <w:sz w:val="22"/>
+                <w:szCs w:val="22"/>
+              </w:rPr>
+            </w:pPr>
+            <w:r>
+              <w:rPr>
+                <w:rFonts w:ascii="Times New Roman" w:hAnsi="Times New Roman" w:cs="Times New Roman"/>
+                <w:b/>
+                <w:sz w:val="22"/>
+                <w:szCs w:val="22"/>
+              </w:rPr>
               <w:t xml:space="preserve">member 6</w:t>
             </w:r>
           </w:p>
@@ -529,12 +1301,82 @@
                 <w:sz w:val="22"/>
                 <w:szCs w:val="22"/>
               </w:rPr>
+              <w:t xml:space="preserve"/>
+            </w:r>
+          </w:p>
+        </w:tc>
+        <w:tc>
+          <w:tcPr>
+            <w:tcW w:w="4059" w:type="dxa"/>
+          </w:tcPr>
+          <w:p>
+            <w:pPr>
+              <w:rPr>
+                <w:rFonts w:ascii="Times New Roman" w:hAnsi="Times New Roman" w:cs="Times New Roman"/>
+                <w:sz w:val="22"/>
+                <w:szCs w:val="22"/>
+              </w:rPr>
+            </w:pPr>
+            <w:r>
+              <w:rPr>
+                <w:rFonts w:ascii="Times New Roman" w:hAnsi="Times New Roman" w:cs="Times New Roman"/>
+                <w:sz w:val="22"/>
+                <w:szCs w:val="22"/>
+              </w:rPr>
+              <w:t xml:space="preserve"/>
+            </w:r>
+          </w:p>
+        </w:tc>
+      </w:tr>
+      <w:tr>
+        <w:tc>
+          <w:tcPr>
+            <w:tcW w:w="1838" w:type="dxa"/>
+          </w:tcPr>
+          <w:p>
+            <w:pPr>
+              <w:rPr>
+                <w:rFonts w:ascii="Times New Roman" w:hAnsi="Times New Roman" w:cs="Times New Roman"/>
+                <w:b/>
+                <w:sz w:val="22"/>
+                <w:szCs w:val="22"/>
+              </w:rPr>
+            </w:pPr>
+            <w:r>
+              <w:rPr>
+                <w:rFonts w:ascii="Times New Roman" w:hAnsi="Times New Roman" w:cs="Times New Roman"/>
+                <w:b/>
+                <w:sz w:val="22"/>
+                <w:szCs w:val="22"/>
+              </w:rPr>
               <w:t xml:space="preserve">QM no:</w:t>
             </w:r>
           </w:p>
         </w:tc>
         <w:tc>
           <w:tcPr>
+            <w:tcW w:w="3119" w:type="dxa"/>
+          </w:tcPr>
+          <w:p>
+            <w:pPr>
+              <w:rPr>
+                <w:rFonts w:ascii="Times New Roman" w:hAnsi="Times New Roman" w:cs="Times New Roman"/>
+                <w:sz w:val="22"/>
+                <w:szCs w:val="22"/>
+              </w:rPr>
+            </w:pPr>
+            <w:r>
+              <w:rPr>
+                <w:rFonts w:ascii="Times New Roman" w:hAnsi="Times New Roman" w:cs="Times New Roman"/>
+                <w:sz w:val="22"/>
+                <w:szCs w:val="22"/>
+              </w:rPr>
+              <w:t xml:space="preserve">231223162</w:t>
+            </w:r>
+          </w:p>
+        </w:tc>
+        <w:tc>
+          <w:tcPr>
             <w:tcW w:w="4059" w:type="dxa"/>
           </w:tcPr>
           <w:p>
@@ -551,7 +1393,77 @@
                 <w:sz w:val="22"/>
                 <w:szCs w:val="22"/>
               </w:rPr>
-              <w:t xml:space="preserve">Name:</w:t>
+              <w:t xml:space="preserve"/>
+            </w:r>
+          </w:p>
+        </w:tc>
+      </w:tr>
+      <w:tr>
+        <w:tc>
+          <w:tcPr>
+            <w:tcW w:w="1838" w:type="dxa"/>
+          </w:tcPr>
+          <w:p>
+            <w:pPr>
+              <w:rPr>
+                <w:rFonts w:ascii="Times New Roman" w:hAnsi="Times New Roman" w:cs="Times New Roman"/>
+                <w:b/>
+                <w:sz w:val="22"/>
+                <w:szCs w:val="22"/>
+              </w:rPr>
+            </w:pPr>
+            <w:r>
+              <w:rPr>
+                <w:rFonts w:ascii="Times New Roman" w:hAnsi="Times New Roman" w:cs="Times New Roman"/>
+                <w:b/>
+                <w:sz w:val="22"/>
+                <w:szCs w:val="22"/>
+              </w:rPr>
+              <w:t xml:space="preserve">ChenyuKANG</w:t>
+            </w:r>
+          </w:p>
+        </w:tc>
+        <w:tc>
+          <w:tcPr>
+            <w:tcW w:w="3119" w:type="dxa"/>
+          </w:tcPr>
+          <w:p>
+            <w:pPr>
+              <w:rPr>
+                <w:rFonts w:ascii="Times New Roman" w:hAnsi="Times New Roman" w:cs="Times New Roman"/>
+                <w:sz w:val="22"/>
+                <w:szCs w:val="22"/>
+              </w:rPr>
+            </w:pPr>
+            <w:r>
+              <w:rPr>
+                <w:rFonts w:ascii="Times New Roman" w:hAnsi="Times New Roman" w:cs="Times New Roman"/>
+                <w:sz w:val="22"/>
+                <w:szCs w:val="22"/>
+              </w:rPr>
+              <w:t xml:space="preserve"/>
+            </w:r>
+          </w:p>
+        </w:tc>
+        <w:tc>
+          <w:tcPr>
+            <w:tcW w:w="4059" w:type="dxa"/>
+          </w:tcPr>
+          <w:p>
+            <w:pPr>
+              <w:rPr>
+                <w:rFonts w:ascii="Times New Roman" w:hAnsi="Times New Roman" w:cs="Times New Roman"/>
+                <w:sz w:val="22"/>
+                <w:szCs w:val="22"/>
+              </w:rPr>
+            </w:pPr>
+            <w:r>
+              <w:rPr>
+                <w:rFonts w:ascii="Times New Roman" w:hAnsi="Times New Roman" w:cs="Times New Roman"/>
+                <w:sz w:val="22"/>
+                <w:szCs w:val="22"/>
+              </w:rPr>
+              <w:t xml:space="preserve"/>
             </w:r>
           </w:p>
         </w:tc>
@@ -834,7 +1746,7 @@
           <w:sz w:val="22"/>
           <w:szCs w:val="22"/>
         </w:rPr>
-        <w:t xml:space="preserve">The project follows an Agile Scrum process over the 8-week laboratory period (Week 3–12). Development is organised into sprints as follows:</w:t>
+        <w:t xml:space="preserve">The project follows an Agile Scrum process over the 8-week laboratory period (Week 3-12). Development is organised into sprints as follows:</w:t>
       </w:r>
     </w:p>
     <w:tbl>
@@ -2307,7 +3219,7 @@
           <w:sz w:val="22"/>
           <w:szCs w:val="22"/>
         </w:rPr>
-        <w:t xml:space="preserve">A low-fidelity prototype was presented to the project supervisor. Feedback received: Positive — overall workflow is intuitive and well-structured. Suggested improvement — add a confirmation step before submitting applications. Suggested improvement — include a status tracking timeline view.</w:t>
+        <w:t xml:space="preserve">A low-fidelity prototype was presented to the project supervisor. Feedback received: Positive - overall workflow is intuitive and well-structured. Suggested improvement - add a confirmation step before submitting applications. Suggested improvement - include a status tracking timeline view.</w:t>
       </w:r>
     </w:p>
     <w:sectPr>

</xml_diff>